<commit_message>
tercer commit, archivo final
</commit_message>
<xml_diff>
--- a/Herramientas.docx
+++ b/Herramientas.docx
@@ -4,13 +4,8 @@
   <w:body>
     <w:p>
       <w:r>
-        <w:t xml:space="preserve">Creación de Repositorio y archivo </w:t>
+        <w:t>Creación de Repositorio y archivo readme</w:t>
       </w:r>
-      <w:proofErr w:type="spellStart"/>
-      <w:r>
-        <w:t>readme</w:t>
-      </w:r>
-      <w:proofErr w:type="spellEnd"/>
     </w:p>
     <w:p>
       <w:r>
@@ -56,27 +51,14 @@
     </w:p>
     <w:p>
       <w:r>
-        <w:t xml:space="preserve">Subir archivo </w:t>
-      </w:r>
-      <w:proofErr w:type="gramStart"/>
-      <w:r>
-        <w:t>readme.md  y</w:t>
-      </w:r>
-      <w:proofErr w:type="gramEnd"/>
-      <w:r>
-        <w:t xml:space="preserve"> primer </w:t>
-      </w:r>
-      <w:proofErr w:type="spellStart"/>
-      <w:r>
-        <w:t>commit</w:t>
-      </w:r>
-      <w:proofErr w:type="spellEnd"/>
-      <w:r>
-        <w:t>.</w:t>
+        <w:t>Subir archivo readme.md  y primer commit.</w:t>
       </w:r>
     </w:p>
     <w:p>
       <w:r>
+        <w:rPr>
+          <w:noProof/>
+        </w:rPr>
         <w:drawing>
           <wp:inline distT="0" distB="0" distL="0" distR="0" wp14:anchorId="66E319E8" wp14:editId="10CD7DCF">
             <wp:extent cx="5400040" cy="1303020"/>
@@ -116,6 +98,9 @@
     </w:p>
     <w:p>
       <w:r>
+        <w:rPr>
+          <w:noProof/>
+        </w:rPr>
         <w:drawing>
           <wp:inline distT="0" distB="0" distL="0" distR="0" wp14:anchorId="1027F686" wp14:editId="6312D378">
             <wp:extent cx="5400040" cy="1510030"/>
@@ -155,24 +140,59 @@
     </w:p>
     <w:p>
       <w:r>
-        <w:t xml:space="preserve">Segundo </w:t>
-      </w:r>
-      <w:proofErr w:type="spellStart"/>
-      <w:r>
-        <w:t>commit</w:t>
-      </w:r>
-      <w:proofErr w:type="spellEnd"/>
-      <w:r>
-        <w:t xml:space="preserve">. </w:t>
+        <w:t xml:space="preserve">Segundo commit. </w:t>
       </w:r>
     </w:p>
-    <w:p/>
+    <w:p>
+      <w:r>
+        <w:lastRenderedPageBreak/>
+        <w:drawing>
+          <wp:inline distT="0" distB="0" distL="0" distR="0" wp14:anchorId="33EC79BC" wp14:editId="45E77C0A">
+            <wp:extent cx="5400040" cy="3329940"/>
+            <wp:effectExtent l="0" t="0" r="0" b="3810"/>
+            <wp:docPr id="5" name="Imagen 5"/>
+            <wp:cNvGraphicFramePr>
+              <a:graphicFrameLocks xmlns:a="http://schemas.openxmlformats.org/drawingml/2006/main" noChangeAspect="1"/>
+            </wp:cNvGraphicFramePr>
+            <a:graphic xmlns:a="http://schemas.openxmlformats.org/drawingml/2006/main">
+              <a:graphicData uri="http://schemas.openxmlformats.org/drawingml/2006/picture">
+                <pic:pic xmlns:pic="http://schemas.openxmlformats.org/drawingml/2006/picture">
+                  <pic:nvPicPr>
+                    <pic:cNvPr id="1" name=""/>
+                    <pic:cNvPicPr/>
+                  </pic:nvPicPr>
+                  <pic:blipFill>
+                    <a:blip r:embed="rId7"/>
+                    <a:stretch>
+                      <a:fillRect/>
+                    </a:stretch>
+                  </pic:blipFill>
+                  <pic:spPr>
+                    <a:xfrm>
+                      <a:off x="0" y="0"/>
+                      <a:ext cx="5400040" cy="3329940"/>
+                    </a:xfrm>
+                    <a:prstGeom prst="rect">
+                      <a:avLst/>
+                    </a:prstGeom>
+                  </pic:spPr>
+                </pic:pic>
+              </a:graphicData>
+            </a:graphic>
+          </wp:inline>
+        </w:drawing>
+      </w:r>
+    </w:p>
+    <w:p>
+      <w:r>
+        <w:t>Invitación al docente a mi repositorio.</w:t>
+      </w:r>
+    </w:p>
     <w:p>
       <w:r>
         <w:rPr>
           <w:noProof/>
         </w:rPr>
-        <w:lastRenderedPageBreak/>
         <w:drawing>
           <wp:inline distT="0" distB="0" distL="0" distR="0" wp14:anchorId="3D3B5557" wp14:editId="2D1EE76E">
             <wp:extent cx="5400040" cy="3373755"/>
@@ -189,7 +209,7 @@
                     <pic:cNvPicPr/>
                   </pic:nvPicPr>
                   <pic:blipFill>
-                    <a:blip r:embed="rId7"/>
+                    <a:blip r:embed="rId8"/>
                     <a:stretch>
                       <a:fillRect/>
                     </a:stretch>

</xml_diff>